<commit_message>
Seperated Screening Questions out, and updated Next Steps Document
</commit_message>
<xml_diff>
--- a/docassemble/MAHousingTRO/data/templates/verified_complaint_and_request_for_next_steps.docx
+++ b/docassemble/MAHousingTRO/data/templates/verified_complaint_and_request_for_next_steps.docx
@@ -18,18 +18,20 @@
       <w:tblGrid>
         <w:gridCol w:w="10800"/>
       </w:tblGrid>
-      <w:tr>
+      <w:tr xmlns:wp14="http://schemas.microsoft.com/office/word/2010/wordml" wp14:textId="77777777">
         <w:tc>
           <w:tcPr>
             <w:tcW w:w="9350" w:type="dxa"/>
             <w:shd w:val="clear" w:color="auto" w:fill="17406D" w:themeFill="text2"/>
+            <w:tcMar/>
           </w:tcPr>
-          <w:p>
+          <w:p wp14:textId="73236D49">
             <w:pPr>
               <w:jc w:val="center"/>
               <w:rPr>
                 <w:rFonts w:cs="Arial"/>
-                <w:b/>
+                <w:b w:val="1"/>
+                <w:bCs w:val="1"/>
                 <w:sz w:val="36"/>
                 <w:szCs w:val="36"/>
               </w:rPr>
@@ -37,17 +39,18 @@
             <w:r>
               <w:rPr>
                 <w:rFonts w:cs="Arial"/>
-                <w:b/>
+                <w:b w:val="1"/>
+                <w:bCs w:val="1"/>
                 <w:sz w:val="36"/>
                 <w:szCs w:val="36"/>
               </w:rPr>
-              <w:t xml:space="preserve">Ask the court for a verified complaint and request for emergency relief</w:t>
+              <w:t>Ask the court for a complaint for emergency relief</w:t>
             </w:r>
           </w:p>
         </w:tc>
       </w:tr>
     </w:tbl>
-    <w:p>
+    <w:p xmlns:wp14="http://schemas.microsoft.com/office/word/2010/wordml" wp14:textId="77777777">
       <w:pPr>
         <w:spacing w:after="80" w:line="240" w:lineRule="auto"/>
         <w:rPr>
@@ -57,39 +60,9 @@
         </w:rPr>
       </w:pPr>
     </w:p>
-    <w:p>
-      <w:r>
-        <w:t xml:space="preserve">Congratulations </w:t>
-      </w:r>
-      <w:r>
-        <w:t>{{</w:t>
-      </w:r>
-      <w:r>
-        <w:t xml:space="preserve"> users </w:t>
-      </w:r>
-      <w:r>
-        <w:t>}}</w:t>
-      </w:r>
-      <w:r>
-        <w:t xml:space="preserve">! You have finished all the forms you need to </w:t>
-      </w:r>
-      <w:r>
-        <w:t xml:space="preserve">Ask the court for a verified complaint and request for emergency relief</w:t>
-      </w:r>
-      <w:r>
-        <w:t xml:space="preserve">. The rest of the pages in this packet are your </w:t>
-      </w:r>
-      <w:r>
-        <w:t xml:space="preserve">application/petition/complaint</w:t>
-      </w:r>
-      <w:r>
-        <w:t>{%</w:t>
-      </w:r>
-      <w:r>
-        <w:t xml:space="preserve"> if other_parties.number()</w:t>
-      </w:r>
-      <w:r>
-        <w:t xml:space="preserve"> %}</w:t>
+    <w:p xmlns:wp14="http://schemas.microsoft.com/office/word/2010/wordml" wp14:textId="77777777">
+      <w:r>
+        <w:t xml:space="preserve">Congratulations {{ users }}! You have finished all the forms you need to Ask the court for a verified complaint and request for emergency relief. The rest of the pages in this packet are your application/petition/complaint{% if other_parties.number() %}</w:t>
       </w:r>
       <w:r>
         <w:rPr>
@@ -104,64 +77,13 @@
         <w:rPr>
           <w:b/>
         </w:rPr>
-        <w:t xml:space="preserve"> </w:t>
-      </w:r>
-      <w:r>
-        <w:rPr>
-          <w:b/>
-        </w:rPr>
-        <w:t>{{</w:t>
-      </w:r>
-      <w:r>
-        <w:rPr>
-          <w:b/>
-        </w:rPr>
-        <w:t xml:space="preserve"> users </w:t>
-      </w:r>
-      <w:r>
-        <w:rPr>
-          <w:b/>
-        </w:rPr>
-        <w:t>}}</w:t>
-      </w:r>
-      <w:r>
-        <w:rPr>
-          <w:b/>
-        </w:rPr>
-        <w:t xml:space="preserve"> v </w:t>
-      </w:r>
-      <w:r>
-        <w:rPr>
-          <w:b/>
-        </w:rPr>
-        <w:t>{{</w:t>
-      </w:r>
-      <w:r>
-        <w:rPr>
-          <w:b/>
-        </w:rPr>
-        <w:t xml:space="preserve"> other_parties </w:t>
-      </w:r>
-      <w:r>
-        <w:rPr>
-          <w:b/>
-        </w:rPr>
-        <w:t>}}</w:t>
-      </w:r>
-      <w:r>
-        <w:t>{%</w:t>
-      </w:r>
-      <w:r>
-        <w:t xml:space="preserve"> endif </w:t>
-      </w:r>
-      <w:r>
-        <w:t>%}</w:t>
-      </w:r>
-      <w:r>
-        <w:t>.</w:t>
-      </w:r>
-    </w:p>
-    <w:p>
+        <w:t xml:space="preserve"> {{ users }} v {{ other_parties }}</w:t>
+      </w:r>
+      <w:r>
+        <w:t xml:space="preserve">{% endif %}.</w:t>
+      </w:r>
+    </w:p>
+    <w:p xmlns:wp14="http://schemas.microsoft.com/office/word/2010/wordml" wp14:textId="77777777">
       <w:pPr>
         <w:spacing w:after="80" w:line="240" w:lineRule="auto"/>
         <w:rPr>
@@ -171,11 +93,11 @@
         </w:rPr>
       </w:pPr>
     </w:p>
-    <w:p>
+    <w:p xmlns:wp14="http://schemas.microsoft.com/office/word/2010/wordml" wp14:textId="77777777">
       <w:pPr>
         <w:sectPr>
           <w:footerReference w:type="default" r:id="rId7"/>
-          <w:pgSz w:w="12240" w:h="15840"/>
+          <w:pgSz w:w="12240" w:h="15840" w:orient="portrait"/>
           <w:pgMar w:top="720" w:right="720" w:bottom="720" w:left="720" w:header="720" w:footer="720" w:gutter="0"/>
           <w:cols w:space="720"/>
           <w:titlePg/>
@@ -183,7 +105,7 @@
         </w:sectPr>
       </w:pPr>
     </w:p>
-    <w:p>
+    <w:p xmlns:wp14="http://schemas.microsoft.com/office/word/2010/wordml" wp14:textId="77777777">
       <w:pPr>
         <w:pStyle w:val="Heading2"/>
       </w:pPr>
@@ -191,7 +113,7 @@
         <w:t>Next steps</w:t>
       </w:r>
     </w:p>
-    <w:p>
+    <w:p xmlns:wp14="http://schemas.microsoft.com/office/word/2010/wordml" wp14:textId="77777777">
       <w:pPr>
         <w:pStyle w:val="ListParagraph"/>
         <w:numPr>
@@ -219,10 +141,7 @@
         <w:t xml:space="preserve">File this </w:t>
       </w:r>
       <w:r>
-        <w:t xml:space="preserve">application/petition/complaint </w:t>
-      </w:r>
-      <w:r>
-        <w:t xml:space="preserve">with the court </w:t>
+        <w:t xml:space="preserve">application/petition/complaint with the court </w:t>
       </w:r>
       <w:r>
         <w:rPr>
@@ -235,7 +154,87 @@
         <w:t>now.</w:t>
       </w:r>
     </w:p>
-    <w:p>
+    <w:p xmlns:wp14="http://schemas.microsoft.com/office/word/2010/wordml" wp14:textId="77777777">
+      <w:pPr>
+        <w:pStyle w:val="ListParagraph"/>
+        <w:numPr>
+          <w:ilvl w:val="0"/>
+          <w:numId w:val="7"/>
+        </w:numPr>
+        <w:suppressAutoHyphens/>
+        <w:snapToGrid w:val="0"/>
+        <w:rPr/>
+      </w:pPr>
+      <w:r>
+        <w:rPr>
+          <w:lang w:val="en-US"/>
+          <w14:textOutline w14:w="9525" w14:cap="rnd" w14:cmpd="sng" w14:algn="ctr">
+            <w14:noFill/>
+            <w14:prstDash w14:val="solid"/>
+            <w14:bevel/>
+          </w14:textOutline>
+        </w:rPr>
+        <w:t xml:space="preserve">Deliver a copy to {{ showifdef('other_parties[0]') }} or their attorney.</w:t>
+      </w:r>
+    </w:p>
+    <w:p xmlns:wp14="http://schemas.microsoft.com/office/word/2010/wordml" wp14:textId="77777777">
+      <w:pPr>
+        <w:pStyle w:val="ListParagraph"/>
+        <w:numPr>
+          <w:ilvl w:val="0"/>
+          <w:numId w:val="7"/>
+        </w:numPr>
+        <w:suppressAutoHyphens/>
+        <w:snapToGrid w:val="0"/>
+        <w:rPr>
+          <w:b w:val="1"/>
+          <w:bCs w:val="1"/>
+          <w:lang w:val="en-US"/>
+          <w14:textOutline w14:w="9525" w14:cap="rnd" w14:cmpd="sng" w14:algn="ctr">
+            <w14:noFill/>
+            <w14:prstDash w14:val="solid"/>
+            <w14:bevel/>
+          </w14:textOutline>
+        </w:rPr>
+      </w:pPr>
+      <w:r>
+        <w:rPr>
+          <w:b w:val="1"/>
+          <w:bCs w:val="1"/>
+          <w:lang w:val="en-US"/>
+          <w14:textOutline w14:w="9525" w14:cap="rnd" w14:cmpd="sng" w14:algn="ctr">
+            <w14:noFill/>
+            <w14:prstDash w14:val="solid"/>
+            <w14:bevel/>
+          </w14:textOutline>
+        </w:rPr>
+        <w:t>Keep a copy for yourself.</w:t>
+      </w:r>
+    </w:p>
+    <w:p xmlns:wp14="http://schemas.microsoft.com/office/word/2010/wordml" wp14:textId="77777777">
+      <w:pPr>
+        <w:pStyle w:val="ListParagraph"/>
+        <w:numPr>
+          <w:ilvl w:val="0"/>
+          <w:numId w:val="7"/>
+        </w:numPr>
+        <w:suppressAutoHyphens/>
+        <w:snapToGrid w:val="0"/>
+        <w:rPr/>
+      </w:pPr>
+      <w:r>
+        <w:rPr>
+          <w:lang w:val="en-US"/>
+          <w14:textOutline w14:w="9525" w14:cap="rnd" w14:cmpd="sng" w14:algn="ctr">
+            <w14:noFill/>
+            <w14:prstDash w14:val="solid"/>
+            <w14:bevel/>
+          </w14:textOutline>
+        </w:rPr>
+        <w:t>The clerk will tell you how to "go to" the hearing.</w:t>
+      </w:r>
+    </w:p>
+    <w:p xmlns:wp14="http://schemas.microsoft.com/office/word/2010/wordml" wp14:textId="77777777">
       <w:pPr>
         <w:pStyle w:val="ListParagraph"/>
         <w:numPr>
@@ -260,190 +259,10 @@
             <w14:bevel/>
           </w14:textOutline>
         </w:rPr>
-        <w:t xml:space="preserve">Deliver a copy to </w:t>
-      </w:r>
-      <w:r>
-        <w:rPr>
-          <w14:textOutline w14:w="9525" w14:cap="rnd" w14:cmpd="sng" w14:algn="ctr">
-            <w14:noFill/>
-            <w14:prstDash w14:val="solid"/>
-            <w14:bevel/>
-          </w14:textOutline>
-        </w:rPr>
-        <w:t>{{</w:t>
-      </w:r>
-      <w:r>
-        <w:rPr>
-          <w14:textOutline w14:w="9525" w14:cap="rnd" w14:cmpd="sng" w14:algn="ctr">
-            <w14:noFill/>
-            <w14:prstDash w14:val="solid"/>
-            <w14:bevel/>
-          </w14:textOutline>
-        </w:rPr>
-        <w:t xml:space="preserve"> showifdef('other_parties[0]') </w:t>
-      </w:r>
-      <w:r>
-        <w:rPr>
-          <w14:textOutline w14:w="9525" w14:cap="rnd" w14:cmpd="sng" w14:algn="ctr">
-            <w14:noFill/>
-            <w14:prstDash w14:val="solid"/>
-            <w14:bevel/>
-          </w14:textOutline>
-        </w:rPr>
-        <w:t>}}</w:t>
-      </w:r>
-      <w:r>
-        <w:rPr>
-          <w14:textOutline w14:w="9525" w14:cap="rnd" w14:cmpd="sng" w14:algn="ctr">
-            <w14:noFill/>
-            <w14:prstDash w14:val="solid"/>
-            <w14:bevel/>
-          </w14:textOutline>
-        </w:rPr>
-        <w:t xml:space="preserve"> or their attorney.</w:t>
-      </w:r>
-    </w:p>
-    <w:p>
-      <w:pPr>
-        <w:pStyle w:val="ListParagraph"/>
-        <w:numPr>
-          <w:ilvl w:val="0"/>
-          <w:numId w:val="7"/>
-        </w:numPr>
-        <w:suppressAutoHyphens/>
-        <w:snapToGrid w:val="0"/>
-        <w:rPr>
-          <w:b/>
-          <w:bCs/>
-          <w14:textOutline w14:w="9525" w14:cap="rnd" w14:cmpd="sng" w14:algn="ctr">
-            <w14:noFill/>
-            <w14:prstDash w14:val="solid"/>
-            <w14:bevel/>
-          </w14:textOutline>
-        </w:rPr>
-      </w:pPr>
-      <w:r>
-        <w:rPr>
-          <w:b/>
-          <w:bCs/>
-          <w14:textOutline w14:w="9525" w14:cap="rnd" w14:cmpd="sng" w14:algn="ctr">
-            <w14:noFill/>
-            <w14:prstDash w14:val="solid"/>
-            <w14:bevel/>
-          </w14:textOutline>
-        </w:rPr>
-        <w:t>Keep a copy for yourself.</w:t>
-      </w:r>
-    </w:p>
-    <w:p>
-      <w:pPr>
-        <w:pStyle w:val="ListParagraph"/>
-        <w:numPr>
-          <w:ilvl w:val="0"/>
-          <w:numId w:val="7"/>
-        </w:numPr>
-        <w:suppressAutoHyphens/>
-        <w:snapToGrid w:val="0"/>
-        <w:rPr>
-          <w14:textOutline w14:w="9525" w14:cap="rnd" w14:cmpd="sng" w14:algn="ctr">
-            <w14:noFill/>
-            <w14:prstDash w14:val="solid"/>
-            <w14:bevel/>
-          </w14:textOutline>
-        </w:rPr>
-      </w:pPr>
-      <w:r>
-        <w:rPr>
-          <w14:textOutline w14:w="9525" w14:cap="rnd" w14:cmpd="sng" w14:algn="ctr">
-            <w14:noFill/>
-            <w14:prstDash w14:val="solid"/>
-            <w14:bevel/>
-          </w14:textOutline>
-        </w:rPr>
-        <w:t>The clerk will tell you how to "go to" the hearing. It will probably happen over the phone or a "Zoom" video conference.</w:t>
-      </w:r>
-    </w:p>
-    <w:p>
-      <w:pPr>
-        <w:pStyle w:val="ListParagraph"/>
-        <w:numPr>
-          <w:ilvl w:val="0"/>
-          <w:numId w:val="7"/>
-        </w:numPr>
-        <w:suppressAutoHyphens/>
-        <w:snapToGrid w:val="0"/>
-        <w:rPr>
-          <w14:textOutline w14:w="9525" w14:cap="rnd" w14:cmpd="sng" w14:algn="ctr">
-            <w14:noFill/>
-            <w14:prstDash w14:val="solid"/>
-            <w14:bevel/>
-          </w14:textOutline>
-        </w:rPr>
-      </w:pPr>
-      <w:r>
-        <w:rPr>
-          <w14:textOutline w14:w="9525" w14:cap="rnd" w14:cmpd="sng" w14:algn="ctr">
-            <w14:noFill/>
-            <w14:prstDash w14:val="solid"/>
-            <w14:bevel/>
-          </w14:textOutline>
-        </w:rPr>
-        <w:t xml:space="preserve">If the judge decides to grant your </w:t>
-      </w:r>
-      <w:r>
-        <w:t xml:space="preserve">application/petition/complaint</w:t>
-      </w:r>
-      <w:r>
-        <w:rPr>
-          <w14:textOutline w14:w="9525" w14:cap="rnd" w14:cmpd="sng" w14:algn="ctr">
-            <w14:noFill/>
-            <w14:prstDash w14:val="solid"/>
-            <w14:bevel/>
-          </w14:textOutline>
-        </w:rPr>
-        <w:t>:</w:t>
-      </w:r>
-      <w:r>
-        <w:rPr>
-          <w14:textOutline w14:w="9525" w14:cap="rnd" w14:cmpd="sng" w14:algn="ctr">
-            <w14:noFill/>
-            <w14:prstDash w14:val="solid"/>
-            <w14:bevel/>
-          </w14:textOutline>
-        </w:rPr>
-        <w:t>.</w:t>
-      </w:r>
-      <w:proofErr w:type="gramEnd"/>
-    </w:p>
-    <w:p>
-      <w:pPr>
-        <w:pStyle w:val="ListParagraph"/>
-        <w:numPr>
-          <w:ilvl w:val="0"/>
-          <w:numId w:val="7"/>
-        </w:numPr>
-        <w:suppressAutoHyphens/>
-        <w:snapToGrid w:val="0"/>
-        <w:rPr>
-          <w14:textOutline w14:w="9525" w14:cap="rnd" w14:cmpd="sng" w14:algn="ctr">
-            <w14:noFill/>
-            <w14:prstDash w14:val="solid"/>
-            <w14:bevel/>
-          </w14:textOutline>
-        </w:rPr>
-      </w:pPr>
-      <w:r>
-        <w:rPr>
-          <w14:textOutline w14:w="9525" w14:cap="rnd" w14:cmpd="sng" w14:algn="ctr">
-            <w14:noFill/>
-            <w14:prstDash w14:val="solid"/>
-            <w14:bevel/>
-          </w14:textOutline>
-        </w:rPr>
         <w:t>Check the order when you get it to make sure it is correct.</w:t>
       </w:r>
     </w:p>
-    <w:p>
+    <w:p xmlns:wp14="http://schemas.microsoft.com/office/word/2010/wordml" wp14:textId="77777777">
       <w:pPr>
         <w:pStyle w:val="Heading2"/>
       </w:pPr>
@@ -451,7 +270,7 @@
         <w:t>To file your application right away</w:t>
       </w:r>
     </w:p>
-    <w:p>
+    <w:p xmlns:wp14="http://schemas.microsoft.com/office/word/2010/wordml" wp14:textId="77777777">
       <w:pPr>
         <w:pStyle w:val="NumberedList"/>
         <w:numPr>
@@ -464,7 +283,7 @@
         <w:t xml:space="preserve">Look over the forms below, one more time. Make sure everything is correct. </w:t>
       </w:r>
     </w:p>
-    <w:p>
+    <w:p xmlns:wp14="http://schemas.microsoft.com/office/word/2010/wordml" wp14:textId="20EBAA04">
       <w:pPr>
         <w:pStyle w:val="NumberedList"/>
         <w:numPr>
@@ -472,33 +291,20 @@
           <w:numId w:val="8"/>
         </w:numPr>
         <w:suppressAutoHyphens/>
-      </w:pPr>
-      <w:r>
-        <w:t xml:space="preserve">Call the </w:t>
-      </w:r>
-      <w:r>
-        <w:t xml:space="preserve">{{ </w:t>
-      </w:r>
-      <w:r>
-        <w:t xml:space="preserve">trial_court </w:t>
-      </w:r>
-      <w:r>
-        <w:t>}}</w:t>
-      </w:r>
-      <w:r>
-        <w:t xml:space="preserve"> </w:t>
-      </w:r>
-      <w:r>
-        <w:t xml:space="preserve">{{ </w:t>
-      </w:r>
-      <w:r>
-        <w:t xml:space="preserve">showifdef('trial_court.phone_number') </w:t>
-      </w:r>
-      <w:r>
-        <w:t>}}</w:t>
-      </w:r>
-      <w:r>
-        <w:t xml:space="preserve"> to find out how they want you to send your forms to them.</w:t>
+        <w:rPr>
+          <w:lang w:val="en-US"/>
+        </w:rPr>
+      </w:pPr>
+      <w:r>
+        <w:rPr>
+          <w:lang w:val="en-US"/>
+        </w:rPr>
+        <w:t xml:space="preserve">Go to {{ trial_court }} to submit the forms to the clerk.</w:t>
+      </w:r>
+    </w:p>
+    <w:p>
+      <w:r>
+        <w:t xml:space="preserve">{%p if defined('trial_court.address.address') %}</w:t>
       </w:r>
     </w:p>
     <w:p>
@@ -508,56 +314,24 @@
           <w:ilvl w:val="0"/>
           <w:numId w:val="8"/>
         </w:numPr>
-      </w:pPr>
-      <w:r>
-        <w:t>{%</w:t>
-      </w:r>
-      <w:r>
-        <w:t xml:space="preserve">p if defined('trial_court.address.address') </w:t>
-      </w:r>
-      <w:r>
-        <w:t>%}</w:t>
-      </w:r>
-      <w:r>
-        <w:t xml:space="preserve"> The address of your court, if you need it, is: </w:t>
-      </w:r>
-      <w:bookmarkStart w:id="0" w:name="_ayzduvo09uaz"/>
-      <w:bookmarkEnd w:id="0"/>
-      <w:r>
-        <w:br/>
-      </w:r>
-      <w:r>
-        <w:t xml:space="preserve">{{ </w:t>
-      </w:r>
-      <w:r>
-        <w:t xml:space="preserve">trial_court.address.on_one_line() </w:t>
-      </w:r>
-      <w:r>
-        <w:t>}}</w:t>
-      </w:r>
-      <w:r>
-        <w:t>.</w:t>
+        <w:suppressAutoHyphens/>
+        <w:rPr>
+          <w:lang w:val="en-US"/>
+        </w:rPr>
+      </w:pPr>
+      <w:r>
+        <w:rPr>
+          <w:lang w:val="en-US"/>
+        </w:rPr>
+        <w:t xml:space="preserve">The address is: {{ trial_court.address.on_one_line() }}.</w:t>
       </w:r>
     </w:p>
     <w:p>
-      <w:pPr>
-        <w:pStyle w:val="NumberedList"/>
-        <w:numPr>
-          <w:ilvl w:val="0"/>
-          <w:numId w:val="8"/>
-        </w:numPr>
-      </w:pPr>
-      <w:r>
-        <w:t xml:space="preserve">{%p </w:t>
-      </w:r>
-      <w:r>
-        <w:t xml:space="preserve">endif </w:t>
-      </w:r>
-      <w:r>
-        <w:t>%}</w:t>
-      </w:r>
-    </w:p>
-    <w:p>
+      <w:r>
+        <w:t xml:space="preserve">{%p endif %}</w:t>
+      </w:r>
+    </w:p>
+    <w:p xmlns:wp14="http://schemas.microsoft.com/office/word/2010/wordml" wp14:textId="77777777">
       <w:pPr>
         <w:pStyle w:val="Heading2"/>
       </w:pPr>
@@ -565,7 +339,7 @@
         <w:t>Serving the other party</w:t>
       </w:r>
     </w:p>
-    <w:p>
+    <w:p xmlns:wp14="http://schemas.microsoft.com/office/word/2010/wordml" wp14:textId="77777777">
       <w:pPr>
         <w:pStyle w:val="NumberedList"/>
         <w:numPr>
@@ -574,52 +348,33 @@
         </w:numPr>
         <w:rPr>
           <w:rFonts w:ascii="Arial" w:hAnsi="Arial" w:cs="Arial"/>
+          <w:lang w:val="en-US"/>
         </w:rPr>
       </w:pPr>
       <w:r>
         <w:rPr>
           <w:rFonts w:ascii="Arial" w:hAnsi="Arial" w:cs="Arial"/>
+          <w:lang w:val="en-US"/>
         </w:rPr>
-        <w:t>{{</w:t>
-      </w:r>
-      <w:r>
-        <w:rPr>
-          <w:rFonts w:ascii="Arial" w:hAnsi="Arial" w:cs="Arial"/>
-        </w:rPr>
-        <w:t xml:space="preserve"> other_parties </w:t>
-      </w:r>
-      <w:r>
-        <w:rPr>
-          <w:rFonts w:ascii="Arial" w:hAnsi="Arial" w:cs="Arial"/>
-        </w:rPr>
-        <w:t>}}</w:t>
-      </w:r>
-      <w:r>
-        <w:rPr>
-          <w:rFonts w:ascii="Arial" w:hAnsi="Arial" w:cs="Arial"/>
-        </w:rPr>
-        <w:t xml:space="preserve"> must get a copy of this form. Deliver a copy by hand, mail, or electronic filing.</w:t>
+        <w:t xml:space="preserve">{{ other_parties }} must get a copy of your complaint and any order the court gives you. The court’s order, and any order of notice or summons, must be served on {{ other_parties }} by a sheriff or constable — you cannot serve it yourself. Keep a copy of everything for your records.</w:t>
       </w:r>
     </w:p>
     <w:p>
       <w:pPr>
-        <w:pStyle w:val="NumberedList"/>
-        <w:rPr>
-          <w:rFonts w:ascii="Arial" w:hAnsi="Arial" w:cs="Arial"/>
-        </w:rPr>
-      </w:pPr>
+        <w:pStyle w:val="Heading2"/>
+      </w:pPr>
+      <w:r>
+        <w:t xml:space="preserve">What happens after you file?</w:t>
+      </w:r>
     </w:p>
     <w:p>
-      <w:pPr>
-        <w:pStyle w:val="Heading2"/>
-      </w:pPr>
-      <w:r>
-        <w:t>What happens in the hearing?</w:t>
+      <w:r>
+        <w:t xml:space="preserve">After you file, a judge will review your complaint. Because this is an emergency, the judge can act quickly. The court will tell you the date, time, and place of any hearing, so watch for the court’s order and notice.</w:t>
       </w:r>
     </w:p>
     <w:p>
       <w:r>
-        <w:t xml:space="preserve">The judge reads your complaint and your evidence. They may ask you questions.</w:t>
+        <w:t xml:space="preserve">{%p if showifdef("issue_tro") %}</w:t>
       </w:r>
     </w:p>
     <w:p>
@@ -627,74 +382,70 @@
         <w:rPr>
           <w:b/>
         </w:rPr>
-        <w:t xml:space="preserve">Tell</w:t>
-      </w:r>
-      <w:r>
-        <w:t xml:space="preserve"> the judge why you need a Verified complaint and request for emergency relief. Talk about the facts that you wrote in your complaint. Tell the judge about any evidence that you have.</w:t>
+        <w:t xml:space="preserve">If you asked for a Temporary Restraining Order (TRO): </w:t>
+      </w:r>
+      <w:r>
+        <w:t xml:space="preserve">The judge can grant a TRO even if {{ other_parties }} is not there (“ex parte”). A TRO is a short-term order that lasts no more than 10 days. If the judge grants it, the court will set a hearing within 10 days to decide whether to continue the order. {{ other_parties }} can ask the court to change or end the TRO on 2 days’ notice.</w:t>
       </w:r>
     </w:p>
     <w:p>
-      <w:pPr>
-        <w:pStyle w:val="Heading2"/>
-      </w:pPr>
-      <w:r>
-        <w:t>What can the judge do?</w:t>
+      <w:r>
+        <w:t xml:space="preserve">{%p endif %}</w:t>
       </w:r>
     </w:p>
     <w:p>
       <w:r>
-        <w:t xml:space="preserve">The judge can:</w:t>
+        <w:t xml:space="preserve">{%p if showifdef("request_pi") %}</w:t>
       </w:r>
     </w:p>
     <w:p>
-      <w:pPr>
-        <w:pStyle w:val="Heading2"/>
-      </w:pPr>
-      <w:r>
-        <w:t>What happens if the judge makes the order?</w:t>
-      </w:r>
-    </w:p>
-    <w:p>
-      <w:r>
-        <w:t xml:space="preserve">If the judge decides to grant your order, they:</w:t>
-      </w:r>
-    </w:p>
-    <w:p>
-      <w:pPr>
-        <w:pStyle w:val="FrameContents"/>
+      <w:r>
         <w:rPr>
-          <w:rFonts w:ascii="Arial" w:hAnsi="Arial" w:cs="Arial"/>
-        </w:rPr>
-      </w:pPr>
-      <w:r>
-        <w:rPr>
-          <w:rFonts w:ascii="Arial" w:hAnsi="Arial" w:cs="Arial"/>
           <w:b/>
         </w:rPr>
-        <w:t xml:space="preserve">Read </w:t>
-      </w:r>
+        <w:t xml:space="preserve">If you asked for a Preliminary Injunction: </w:t>
+      </w:r>
+      <w:r>
+        <w:t xml:space="preserve">A preliminary injunction can last longer than a TRO — often until your case is decided. The court cannot issue one without first giving {{ other_parties }} notice and a chance to be heard, so the court will hold a hearing where both you and {{ other_parties }} can appear.</w:t>
+      </w:r>
+    </w:p>
+    <w:p>
+      <w:r>
+        <w:t xml:space="preserve">{%p endif %}</w:t>
+      </w:r>
+    </w:p>
+    <w:p>
+      <w:r>
+        <w:t xml:space="preserve">{%p if showifdef("issue_son") %}</w:t>
+      </w:r>
+    </w:p>
+    <w:p>
       <w:r>
         <w:rPr>
-          <w:rFonts w:ascii="Arial" w:hAnsi="Arial" w:cs="Arial"/>
+          <w:b/>
         </w:rPr>
-        <w:t>the order as soon as you get it. Call the court to fix any mistakes. You may need to go back in front of the judge to get the order corrected.</w:t>
+        <w:t xml:space="preserve">If you asked for a Short Order of Notice: </w:t>
+      </w:r>
+      <w:r>
+        <w:t xml:space="preserve">This shortens the time {{ other_parties }} would normally get before a hearing, so the court can hear your request sooner. If the judge allows it, the court will set an earlier hearing date and tell you how and by when to notify {{ other_parties }}.</w:t>
       </w:r>
     </w:p>
     <w:p>
-      <w:pPr>
-        <w:pStyle w:val="Heading2"/>
-      </w:pPr>
-      <w:r>
-        <w:lastRenderedPageBreak/>
-        <w:t xml:space="preserve">Learn more</w:t>
-      </w:r>
-    </w:p>
-    <w:p/>
+      <w:r>
+        <w:t xml:space="preserve">{%p endif %}</w:t>
+      </w:r>
+    </w:p>
+    <w:p>
+      <w:r>
+        <w:t xml:space="preserve">Before it issues an order, the court may require you to post security (a “bond”), unless it waives that requirement.</w:t>
+      </w:r>
+    </w:p>
+    <w:p xmlns:wp14="http://schemas.microsoft.com/office/word/2010/wordml" wp14:textId="77777777"/>
     <w:sectPr>
       <w:type w:val="continuous"/>
-      <w:pgSz w:w="12240" w:h="15840"/>
+      <w:pgSz w:w="12240" w:h="15840" w:orient="portrait"/>
       <w:pgMar w:top="720" w:right="720" w:bottom="720" w:left="720" w:header="720" w:footer="720" w:gutter="0"/>
-      <w:cols w:num="2" w:space="720"/>
+      <w:cols w:space="720" w:num="2"/>
       <w:docGrid w:linePitch="360"/>
     </w:sectPr>
   </w:body>
@@ -704,7 +455,7 @@
 <file path=word/endnotes.xml><?xml version="1.0" encoding="utf-8"?>
 <w:endnotes xmlns:wpc="http://schemas.microsoft.com/office/word/2010/wordprocessingCanvas" xmlns:cx="http://schemas.microsoft.com/office/drawing/2014/chartex" xmlns:cx1="http://schemas.microsoft.com/office/drawing/2015/9/8/chartex" xmlns:cx2="http://schemas.microsoft.com/office/drawing/2015/10/21/chartex" xmlns:cx3="http://schemas.microsoft.com/office/drawing/2016/5/9/chartex" xmlns:cx4="http://schemas.microsoft.com/office/drawing/2016/5/10/chartex" xmlns:cx5="http://schemas.microsoft.com/office/drawing/2016/5/11/chartex" xmlns:cx6="http://schemas.microsoft.com/office/drawing/2016/5/12/chartex" xmlns:cx7="http://schemas.microsoft.com/office/drawing/2016/5/13/chartex" xmlns:cx8="http://schemas.microsoft.com/office/drawing/2016/5/14/chartex" xmlns:mc="http://schemas.openxmlformats.org/markup-compatibility/2006" xmlns:aink="http://schemas.microsoft.com/office/drawing/2016/ink" xmlns:am3d="http://schemas.microsoft.com/office/drawing/2017/model3d" xmlns:o="urn:schemas-microsoft-com:office:office" xmlns:r="http://schemas.openxmlformats.org/officeDocument/2006/relationships" xmlns:m="http://schemas.openxmlformats.org/officeDocument/2006/math" xmlns:v="urn:schemas-microsoft-com:vml" xmlns:wp14="http://schemas.microsoft.com/office/word/2010/wordprocessingDrawing" xmlns:wp="http://schemas.openxmlformats.org/drawingml/2006/wordprocessingDrawing" xmlns:w10="urn:schemas-microsoft-com:office:word" xmlns:w="http://schemas.openxmlformats.org/wordprocessingml/2006/main" xmlns:w14="http://schemas.microsoft.com/office/word/2010/wordml" xmlns:w15="http://schemas.microsoft.com/office/word/2012/wordml" xmlns:w16cid="http://schemas.microsoft.com/office/word/2016/wordml/cid" xmlns:w16se="http://schemas.microsoft.com/office/word/2015/wordml/symex" xmlns:wpg="http://schemas.microsoft.com/office/word/2010/wordprocessingGroup" xmlns:wpi="http://schemas.microsoft.com/office/word/2010/wordprocessingInk" xmlns:wne="http://schemas.microsoft.com/office/word/2006/wordml" xmlns:wps="http://schemas.microsoft.com/office/word/2010/wordprocessingShape" mc:Ignorable="w14 w15 w16se w16cid wp14">
   <w:endnote w:type="separator" w:id="-1">
-    <w:p>
+    <w:p xmlns:wp14="http://schemas.microsoft.com/office/word/2010/wordml" wp14:textId="77777777">
       <w:pPr>
         <w:spacing w:after="0" w:line="240" w:lineRule="auto"/>
       </w:pPr>
@@ -714,7 +465,7 @@
     </w:p>
   </w:endnote>
   <w:endnote w:type="continuationSeparator" w:id="0">
-    <w:p>
+    <w:p xmlns:wp14="http://schemas.microsoft.com/office/word/2010/wordml" wp14:textId="77777777">
       <w:pPr>
         <w:spacing w:after="0" w:line="240" w:lineRule="auto"/>
       </w:pPr>
@@ -727,8 +478,8 @@
 </file>
 
 <file path=word/footer1.xml><?xml version="1.0" encoding="utf-8"?>
-<w:ftr xmlns:wpc="http://schemas.microsoft.com/office/word/2010/wordprocessingCanvas" xmlns:cx="http://schemas.microsoft.com/office/drawing/2014/chartex" xmlns:cx1="http://schemas.microsoft.com/office/drawing/2015/9/8/chartex" xmlns:cx2="http://schemas.microsoft.com/office/drawing/2015/10/21/chartex" xmlns:cx3="http://schemas.microsoft.com/office/drawing/2016/5/9/chartex" xmlns:cx4="http://schemas.microsoft.com/office/drawing/2016/5/10/chartex" xmlns:cx5="http://schemas.microsoft.com/office/drawing/2016/5/11/chartex" xmlns:cx6="http://schemas.microsoft.com/office/drawing/2016/5/12/chartex" xmlns:cx7="http://schemas.microsoft.com/office/drawing/2016/5/13/chartex" xmlns:cx8="http://schemas.microsoft.com/office/drawing/2016/5/14/chartex" xmlns:mc="http://schemas.openxmlformats.org/markup-compatibility/2006" xmlns:aink="http://schemas.microsoft.com/office/drawing/2016/ink" xmlns:am3d="http://schemas.microsoft.com/office/drawing/2017/model3d" xmlns:o="urn:schemas-microsoft-com:office:office" xmlns:r="http://schemas.openxmlformats.org/officeDocument/2006/relationships" xmlns:m="http://schemas.openxmlformats.org/officeDocument/2006/math" xmlns:v="urn:schemas-microsoft-com:vml" xmlns:wp14="http://schemas.microsoft.com/office/word/2010/wordprocessingDrawing" xmlns:wp="http://schemas.openxmlformats.org/drawingml/2006/wordprocessingDrawing" xmlns:w10="urn:schemas-microsoft-com:office:word" xmlns:w="http://schemas.openxmlformats.org/wordprocessingml/2006/main" xmlns:w14="http://schemas.microsoft.com/office/word/2010/wordml" xmlns:w15="http://schemas.microsoft.com/office/word/2012/wordml" xmlns:w16cid="http://schemas.microsoft.com/office/word/2016/wordml/cid" xmlns:w16se="http://schemas.microsoft.com/office/word/2015/wordml/symex" xmlns:wpg="http://schemas.microsoft.com/office/word/2010/wordprocessingGroup" xmlns:wpi="http://schemas.microsoft.com/office/word/2010/wordprocessingInk" xmlns:wne="http://schemas.microsoft.com/office/word/2006/wordml" xmlns:wps="http://schemas.microsoft.com/office/word/2010/wordprocessingShape" mc:Ignorable="w14 w15 w16se w16cid wp14">
-  <w:p>
+<w:ftr xmlns:wpc="http://schemas.microsoft.com/office/word/2010/wordprocessingCanvas" xmlns:cx="http://schemas.microsoft.com/office/drawing/2014/chartex" xmlns:cx1="http://schemas.microsoft.com/office/drawing/2015/9/8/chartex" xmlns:cx2="http://schemas.microsoft.com/office/drawing/2015/10/21/chartex" xmlns:cx3="http://schemas.microsoft.com/office/drawing/2016/5/9/chartex" xmlns:cx4="http://schemas.microsoft.com/office/drawing/2016/5/10/chartex" xmlns:cx5="http://schemas.microsoft.com/office/drawing/2016/5/11/chartex" xmlns:cx6="http://schemas.microsoft.com/office/drawing/2016/5/12/chartex" xmlns:cx7="http://schemas.microsoft.com/office/drawing/2016/5/13/chartex" xmlns:cx8="http://schemas.microsoft.com/office/drawing/2016/5/14/chartex" xmlns:mc="http://schemas.openxmlformats.org/markup-compatibility/2006" xmlns:aink="http://schemas.microsoft.com/office/drawing/2016/ink" xmlns:am3d="http://schemas.microsoft.com/office/drawing/2017/model3d" xmlns:o="urn:schemas-microsoft-com:office:office" xmlns:r="http://schemas.openxmlformats.org/officeDocument/2006/relationships" xmlns:m="http://schemas.openxmlformats.org/officeDocument/2006/math" xmlns:v="urn:schemas-microsoft-com:vml" xmlns:wp14="http://schemas.microsoft.com/office/word/2010/wordprocessingDrawing" xmlns:wp="http://schemas.openxmlformats.org/drawingml/2006/wordprocessingDrawing" xmlns:w10="urn:schemas-microsoft-com:office:word" xmlns:w="http://schemas.openxmlformats.org/wordprocessingml/2006/main" xmlns:w14="http://schemas.microsoft.com/office/word/2010/wordml" xmlns:w15="http://schemas.microsoft.com/office/word/2012/wordml" xmlns:w16cid="http://schemas.microsoft.com/office/word/2016/wordml/cid" xmlns:w16se="http://schemas.microsoft.com/office/word/2015/wordml/symex" xmlns:wpg="http://schemas.microsoft.com/office/word/2010/wordprocessingGroup" xmlns:wpi="http://schemas.microsoft.com/office/word/2010/wordprocessingInk" xmlns:wne="http://schemas.microsoft.com/office/word/2006/wordml" xmlns:wps="http://schemas.microsoft.com/office/word/2010/wordprocessingShape" xmlns:a="http://schemas.openxmlformats.org/drawingml/2006/main" mc:Ignorable="w14 w15 w16se w16cid wp14">
+  <w:p xmlns:wp14="http://schemas.microsoft.com/office/word/2010/wordml" wp14:textId="77777777">
     <w:pPr>
       <w:pStyle w:val="Footer"/>
     </w:pPr>
@@ -739,7 +490,7 @@
       <mc:AlternateContent>
         <mc:Choice Requires="wps">
           <w:drawing>
-            <wp:inline distT="0" distB="0" distL="0" distR="0" wp14:anchorId="6E0D32D0" wp14:editId="0B633985">
+            <wp:inline xmlns:wp14="http://schemas.microsoft.com/office/word/2010/wordprocessingDrawing" distT="0" distB="0" distL="0" distR="0" wp14:anchorId="6E0D32D0" wp14:editId="0B633985">
               <wp:extent cx="6855460" cy="806450"/>
               <wp:effectExtent l="0" t="0" r="21590" b="12700"/>
               <wp:docPr id="1" name="Rounded Rectangle 6"/>
@@ -790,7 +541,7 @@
                     </wps:style>
                     <wps:txbx>
                       <w:txbxContent>
-                        <w:p>
+                        <w:p xmlns:wp14="http://schemas.microsoft.com/office/word/2010/wordml" wp14:textId="77777777">
                           <w:pPr>
                             <w:pStyle w:val="FrameContents"/>
                             <w:rPr>
@@ -807,7 +558,7 @@
                             <w:t xml:space="preserve">Find out more about what to do : </w:t>
                           </w:r>
                         </w:p>
-                        <w:p/>
+                        <w:p xmlns:wp14="http://schemas.microsoft.com/office/word/2010/wordml" wp14:textId="77777777"/>
                       </w:txbxContent>
                     </wps:txbx>
                     <wps:bodyPr lIns="182880" tIns="182880" rIns="182880" bIns="182880" anchor="ctr">
@@ -823,12 +574,12 @@
           </w:drawing>
         </mc:Choice>
         <mc:Fallback>
-          <w:pict>
-            <v:roundrect w14:anchorId="6E0D32D0" id="Rounded Rectangle 6" o:spid="_x0000_s1026" style="width:539.8pt;height:63.5pt;visibility:visible;mso-wrap-style:square;mso-left-percent:-10001;mso-top-percent:-10001;mso-position-horizontal:absolute;mso-position-horizontal-relative:char;mso-position-vertical:absolute;mso-position-vertical-relative:line;mso-left-percent:-10001;mso-top-percent:-10001;v-text-anchor:middle" arcsize="10923f" o:gfxdata="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" fillcolor="#f2f2f2 [3052]" strokecolor="#bfbfbf [2412]" strokeweight=".18mm">
+          <w:pict w14:anchorId="07B2AE31">
+            <v:roundrect id="Rounded Rectangle 6" style="width:539.8pt;height:63.5pt;visibility:visible;mso-wrap-style:square;mso-left-percent:-10001;mso-top-percent:-10001;mso-position-horizontal:absolute;mso-position-horizontal-relative:char;mso-position-vertical:absolute;mso-position-vertical-relative:line;mso-left-percent:-10001;mso-top-percent:-10001;v-text-anchor:middle" o:spid="_x0000_s1026" fillcolor="#f2f2f2 [3052]" strokecolor="#bfbfbf [2412]" strokeweight=".18mm" arcsize="10923f" w14:anchorId="6E0D32D0" o:gfxdata="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">
               <v:stroke joinstyle="miter"/>
               <v:textbox inset="14.4pt,14.4pt,14.4pt,14.4pt">
                 <w:txbxContent>
-                  <w:p>
+                  <w:p wp14:textId="77777777">
                     <w:pPr>
                       <w:pStyle w:val="FrameContents"/>
                       <w:rPr>
@@ -845,7 +596,7 @@
                       <w:t xml:space="preserve">Find out more about what to do : </w:t>
                     </w:r>
                   </w:p>
-                  <w:p/>
+                  <w:p wp14:textId="77777777"/>
                 </w:txbxContent>
               </v:textbox>
               <w10:anchorlock/>
@@ -861,7 +612,7 @@
 <file path=word/footnotes.xml><?xml version="1.0" encoding="utf-8"?>
 <w:footnotes xmlns:wpc="http://schemas.microsoft.com/office/word/2010/wordprocessingCanvas" xmlns:cx="http://schemas.microsoft.com/office/drawing/2014/chartex" xmlns:cx1="http://schemas.microsoft.com/office/drawing/2015/9/8/chartex" xmlns:cx2="http://schemas.microsoft.com/office/drawing/2015/10/21/chartex" xmlns:cx3="http://schemas.microsoft.com/office/drawing/2016/5/9/chartex" xmlns:cx4="http://schemas.microsoft.com/office/drawing/2016/5/10/chartex" xmlns:cx5="http://schemas.microsoft.com/office/drawing/2016/5/11/chartex" xmlns:cx6="http://schemas.microsoft.com/office/drawing/2016/5/12/chartex" xmlns:cx7="http://schemas.microsoft.com/office/drawing/2016/5/13/chartex" xmlns:cx8="http://schemas.microsoft.com/office/drawing/2016/5/14/chartex" xmlns:mc="http://schemas.openxmlformats.org/markup-compatibility/2006" xmlns:aink="http://schemas.microsoft.com/office/drawing/2016/ink" xmlns:am3d="http://schemas.microsoft.com/office/drawing/2017/model3d" xmlns:o="urn:schemas-microsoft-com:office:office" xmlns:r="http://schemas.openxmlformats.org/officeDocument/2006/relationships" xmlns:m="http://schemas.openxmlformats.org/officeDocument/2006/math" xmlns:v="urn:schemas-microsoft-com:vml" xmlns:wp14="http://schemas.microsoft.com/office/word/2010/wordprocessingDrawing" xmlns:wp="http://schemas.openxmlformats.org/drawingml/2006/wordprocessingDrawing" xmlns:w10="urn:schemas-microsoft-com:office:word" xmlns:w="http://schemas.openxmlformats.org/wordprocessingml/2006/main" xmlns:w14="http://schemas.microsoft.com/office/word/2010/wordml" xmlns:w15="http://schemas.microsoft.com/office/word/2012/wordml" xmlns:w16cid="http://schemas.microsoft.com/office/word/2016/wordml/cid" xmlns:w16se="http://schemas.microsoft.com/office/word/2015/wordml/symex" xmlns:wpg="http://schemas.microsoft.com/office/word/2010/wordprocessingGroup" xmlns:wpi="http://schemas.microsoft.com/office/word/2010/wordprocessingInk" xmlns:wne="http://schemas.microsoft.com/office/word/2006/wordml" xmlns:wps="http://schemas.microsoft.com/office/word/2010/wordprocessingShape" mc:Ignorable="w14 w15 w16se w16cid wp14">
   <w:footnote w:type="separator" w:id="-1">
-    <w:p>
+    <w:p xmlns:wp14="http://schemas.microsoft.com/office/word/2010/wordml" wp14:textId="77777777">
       <w:pPr>
         <w:spacing w:after="0" w:line="240" w:lineRule="auto"/>
       </w:pPr>
@@ -871,7 +622,7 @@
     </w:p>
   </w:footnote>
   <w:footnote w:type="continuationSeparator" w:id="0">
-    <w:p>
+    <w:p xmlns:wp14="http://schemas.microsoft.com/office/word/2010/wordml" wp14:textId="77777777">
       <w:pPr>
         <w:spacing w:after="0" w:line="240" w:lineRule="auto"/>
       </w:pPr>
@@ -1004,7 +755,7 @@
         <w:ind w:left="1440" w:hanging="360"/>
       </w:pPr>
       <w:rPr>
-        <w:rFonts w:ascii="Wingdings 2" w:hAnsi="Wingdings 2" w:cs="Wingdings 2" w:hint="default"/>
+        <w:rFonts w:hint="default" w:ascii="Wingdings 2" w:hAnsi="Wingdings 2" w:cs="Wingdings 2"/>
         <w:u w:val="none"/>
       </w:rPr>
     </w:lvl>
@@ -1123,7 +874,7 @@
         <w:ind w:left="1440" w:hanging="360"/>
       </w:pPr>
       <w:rPr>
-        <w:rFonts w:ascii="Wingdings 2" w:hAnsi="Wingdings 2" w:cs="Wingdings 2" w:hint="default"/>
+        <w:rFonts w:hint="default" w:ascii="Wingdings 2" w:hAnsi="Wingdings 2" w:cs="Wingdings 2"/>
         <w:u w:val="none"/>
       </w:rPr>
     </w:lvl>
@@ -1248,7 +999,7 @@
         <w:ind w:left="1440" w:hanging="360"/>
       </w:pPr>
       <w:rPr>
-        <w:rFonts w:ascii="Wingdings 2" w:hAnsi="Wingdings 2" w:cs="Wingdings 2" w:hint="default"/>
+        <w:rFonts w:hint="default" w:ascii="Wingdings 2" w:hAnsi="Wingdings 2" w:cs="Wingdings 2"/>
       </w:rPr>
     </w:lvl>
     <w:lvl w:ilvl="2">
@@ -1387,7 +1138,7 @@
         <w:ind w:left="1440" w:hanging="360"/>
       </w:pPr>
       <w:rPr>
-        <w:rFonts w:ascii="Wingdings 2" w:hAnsi="Wingdings 2" w:cs="Wingdings 2" w:hint="default"/>
+        <w:rFonts w:hint="default" w:ascii="Wingdings 2" w:hAnsi="Wingdings 2" w:cs="Wingdings 2"/>
         <w:u w:val="none"/>
       </w:rPr>
     </w:lvl>
@@ -1601,7 +1352,7 @@
         <w:ind w:left="1440" w:hanging="360"/>
       </w:pPr>
       <w:rPr>
-        <w:rFonts w:ascii="Wingdings 2" w:hAnsi="Wingdings 2" w:cs="Wingdings 2" w:hint="default"/>
+        <w:rFonts w:hint="default" w:ascii="Wingdings 2" w:hAnsi="Wingdings 2" w:cs="Wingdings 2"/>
       </w:rPr>
     </w:lvl>
     <w:lvl w:ilvl="2">
@@ -1740,7 +1491,7 @@
         <w:ind w:left="1440" w:hanging="360"/>
       </w:pPr>
       <w:rPr>
-        <w:rFonts w:ascii="Wingdings 2" w:hAnsi="Wingdings 2" w:cs="Wingdings 2" w:hint="default"/>
+        <w:rFonts w:hint="default" w:ascii="Wingdings 2" w:hAnsi="Wingdings 2" w:cs="Wingdings 2"/>
         <w:u w:val="none"/>
       </w:rPr>
     </w:lvl>
@@ -1945,7 +1696,7 @@
         <w:ind w:left="1440" w:hanging="360"/>
       </w:pPr>
       <w:rPr>
-        <w:rFonts w:ascii="Wingdings 2" w:hAnsi="Wingdings 2" w:cs="Wingdings 2" w:hint="default"/>
+        <w:rFonts w:hint="default" w:ascii="Wingdings 2" w:hAnsi="Wingdings 2" w:cs="Wingdings 2"/>
         <w:u w:val="none"/>
       </w:rPr>
     </w:lvl>
@@ -2068,11 +1819,11 @@
 </file>
 
 <file path=word/styles.xml><?xml version="1.0" encoding="utf-8"?>
-<w:styles xmlns:mc="http://schemas.openxmlformats.org/markup-compatibility/2006" xmlns:r="http://schemas.openxmlformats.org/officeDocument/2006/relationships" xmlns:w="http://schemas.openxmlformats.org/wordprocessingml/2006/main" xmlns:w14="http://schemas.microsoft.com/office/word/2010/wordml" xmlns:w15="http://schemas.microsoft.com/office/word/2012/wordml" xmlns:w16cid="http://schemas.microsoft.com/office/word/2016/wordml/cid" xmlns:w16se="http://schemas.microsoft.com/office/word/2015/wordml/symex" mc:Ignorable="w14 w15 w16se w16cid">
+<w:styles xmlns:wp14="http://schemas.microsoft.com/office/word/2010/wordprocessingDrawing" xmlns:mc="http://schemas.openxmlformats.org/markup-compatibility/2006" xmlns:r="http://schemas.openxmlformats.org/officeDocument/2006/relationships" xmlns:w="http://schemas.openxmlformats.org/wordprocessingml/2006/main" xmlns:w14="http://schemas.microsoft.com/office/word/2010/wordml" xmlns:w15="http://schemas.microsoft.com/office/word/2012/wordml" xmlns:w16cid="http://schemas.microsoft.com/office/word/2016/wordml/cid" xmlns:w16se="http://schemas.microsoft.com/office/word/2015/wordml/symex" mc:Ignorable="w14 w15 w16se w16cid wp14">
   <w:docDefaults>
     <w:rPrDefault>
       <w:rPr>
-        <w:rFonts w:asciiTheme="minorHAnsi" w:eastAsiaTheme="minorHAnsi" w:hAnsiTheme="minorHAnsi" w:cstheme="minorBidi"/>
+        <w:rFonts w:asciiTheme="minorHAnsi" w:hAnsiTheme="minorHAnsi" w:eastAsiaTheme="minorHAnsi" w:cstheme="minorBidi"/>
         <w:sz w:val="22"/>
         <w:szCs w:val="22"/>
         <w:lang w:val="en-US" w:eastAsia="en-US" w:bidi="ar-SA"/>
@@ -2087,14 +1838,14 @@
   <w:latentStyles w:defLockedState="0" w:defUIPriority="99" w:defSemiHidden="0" w:defUnhideWhenUsed="0" w:defQFormat="0" w:count="375">
     <w:lsdException w:name="Normal" w:uiPriority="0" w:qFormat="1"/>
     <w:lsdException w:name="heading 1" w:uiPriority="9" w:qFormat="1"/>
-    <w:lsdException w:name="heading 2" w:semiHidden="1" w:uiPriority="9" w:unhideWhenUsed="1" w:qFormat="1"/>
-    <w:lsdException w:name="heading 3" w:semiHidden="1" w:uiPriority="9" w:unhideWhenUsed="1" w:qFormat="1"/>
-    <w:lsdException w:name="heading 4" w:semiHidden="1" w:uiPriority="9" w:unhideWhenUsed="1" w:qFormat="1"/>
-    <w:lsdException w:name="heading 5" w:semiHidden="1" w:uiPriority="9" w:unhideWhenUsed="1" w:qFormat="1"/>
-    <w:lsdException w:name="heading 6" w:semiHidden="1" w:uiPriority="9" w:unhideWhenUsed="1" w:qFormat="1"/>
-    <w:lsdException w:name="heading 7" w:semiHidden="1" w:uiPriority="9" w:unhideWhenUsed="1" w:qFormat="1"/>
-    <w:lsdException w:name="heading 8" w:semiHidden="1" w:uiPriority="9" w:unhideWhenUsed="1" w:qFormat="1"/>
-    <w:lsdException w:name="heading 9" w:semiHidden="1" w:uiPriority="9" w:unhideWhenUsed="1" w:qFormat="1"/>
+    <w:lsdException w:name="heading 2" w:uiPriority="9" w:semiHidden="1" w:unhideWhenUsed="1" w:qFormat="1"/>
+    <w:lsdException w:name="heading 3" w:uiPriority="9" w:semiHidden="1" w:unhideWhenUsed="1" w:qFormat="1"/>
+    <w:lsdException w:name="heading 4" w:uiPriority="9" w:semiHidden="1" w:unhideWhenUsed="1" w:qFormat="1"/>
+    <w:lsdException w:name="heading 5" w:uiPriority="9" w:semiHidden="1" w:unhideWhenUsed="1" w:qFormat="1"/>
+    <w:lsdException w:name="heading 6" w:uiPriority="9" w:semiHidden="1" w:unhideWhenUsed="1" w:qFormat="1"/>
+    <w:lsdException w:name="heading 7" w:uiPriority="9" w:semiHidden="1" w:unhideWhenUsed="1" w:qFormat="1"/>
+    <w:lsdException w:name="heading 8" w:uiPriority="9" w:semiHidden="1" w:unhideWhenUsed="1" w:qFormat="1"/>
+    <w:lsdException w:name="heading 9" w:uiPriority="9" w:semiHidden="1" w:unhideWhenUsed="1" w:qFormat="1"/>
     <w:lsdException w:name="index 1" w:semiHidden="1" w:unhideWhenUsed="1"/>
     <w:lsdException w:name="index 2" w:semiHidden="1" w:unhideWhenUsed="1"/>
     <w:lsdException w:name="index 3" w:semiHidden="1" w:unhideWhenUsed="1"/>
@@ -2104,22 +1855,22 @@
     <w:lsdException w:name="index 7" w:semiHidden="1" w:unhideWhenUsed="1"/>
     <w:lsdException w:name="index 8" w:semiHidden="1" w:unhideWhenUsed="1"/>
     <w:lsdException w:name="index 9" w:semiHidden="1" w:unhideWhenUsed="1"/>
-    <w:lsdException w:name="toc 1" w:semiHidden="1" w:uiPriority="39" w:unhideWhenUsed="1"/>
-    <w:lsdException w:name="toc 2" w:semiHidden="1" w:uiPriority="39" w:unhideWhenUsed="1"/>
-    <w:lsdException w:name="toc 3" w:semiHidden="1" w:uiPriority="39" w:unhideWhenUsed="1"/>
-    <w:lsdException w:name="toc 4" w:semiHidden="1" w:uiPriority="39" w:unhideWhenUsed="1"/>
-    <w:lsdException w:name="toc 5" w:semiHidden="1" w:uiPriority="39" w:unhideWhenUsed="1"/>
-    <w:lsdException w:name="toc 6" w:semiHidden="1" w:uiPriority="39" w:unhideWhenUsed="1"/>
-    <w:lsdException w:name="toc 7" w:semiHidden="1" w:uiPriority="39" w:unhideWhenUsed="1"/>
-    <w:lsdException w:name="toc 8" w:semiHidden="1" w:uiPriority="39" w:unhideWhenUsed="1"/>
-    <w:lsdException w:name="toc 9" w:semiHidden="1" w:uiPriority="39" w:unhideWhenUsed="1"/>
+    <w:lsdException w:name="toc 1" w:uiPriority="39" w:semiHidden="1" w:unhideWhenUsed="1"/>
+    <w:lsdException w:name="toc 2" w:uiPriority="39" w:semiHidden="1" w:unhideWhenUsed="1"/>
+    <w:lsdException w:name="toc 3" w:uiPriority="39" w:semiHidden="1" w:unhideWhenUsed="1"/>
+    <w:lsdException w:name="toc 4" w:uiPriority="39" w:semiHidden="1" w:unhideWhenUsed="1"/>
+    <w:lsdException w:name="toc 5" w:uiPriority="39" w:semiHidden="1" w:unhideWhenUsed="1"/>
+    <w:lsdException w:name="toc 6" w:uiPriority="39" w:semiHidden="1" w:unhideWhenUsed="1"/>
+    <w:lsdException w:name="toc 7" w:uiPriority="39" w:semiHidden="1" w:unhideWhenUsed="1"/>
+    <w:lsdException w:name="toc 8" w:uiPriority="39" w:semiHidden="1" w:unhideWhenUsed="1"/>
+    <w:lsdException w:name="toc 9" w:uiPriority="39" w:semiHidden="1" w:unhideWhenUsed="1"/>
     <w:lsdException w:name="Normal Indent" w:semiHidden="1" w:unhideWhenUsed="1"/>
     <w:lsdException w:name="footnote text" w:semiHidden="1" w:unhideWhenUsed="1"/>
     <w:lsdException w:name="annotation text" w:semiHidden="1" w:unhideWhenUsed="1"/>
     <w:lsdException w:name="header" w:semiHidden="1" w:unhideWhenUsed="1"/>
     <w:lsdException w:name="footer" w:semiHidden="1" w:unhideWhenUsed="1"/>
     <w:lsdException w:name="index heading" w:semiHidden="1" w:unhideWhenUsed="1"/>
-    <w:lsdException w:name="caption" w:semiHidden="1" w:uiPriority="35" w:unhideWhenUsed="1" w:qFormat="1"/>
+    <w:lsdException w:name="caption" w:uiPriority="35" w:semiHidden="1" w:unhideWhenUsed="1" w:qFormat="1"/>
     <w:lsdException w:name="table of figures" w:semiHidden="1" w:unhideWhenUsed="1"/>
     <w:lsdException w:name="envelope address" w:semiHidden="1" w:unhideWhenUsed="1"/>
     <w:lsdException w:name="envelope return" w:semiHidden="1" w:unhideWhenUsed="1"/>
@@ -2150,7 +1901,7 @@
     <w:lsdException w:name="Title" w:uiPriority="10" w:qFormat="1"/>
     <w:lsdException w:name="Closing" w:semiHidden="1" w:unhideWhenUsed="1"/>
     <w:lsdException w:name="Signature" w:semiHidden="1" w:unhideWhenUsed="1"/>
-    <w:lsdException w:name="Default Paragraph Font" w:semiHidden="1" w:uiPriority="1" w:unhideWhenUsed="1"/>
+    <w:lsdException w:name="Default Paragraph Font" w:uiPriority="1" w:semiHidden="1" w:unhideWhenUsed="1"/>
     <w:lsdException w:name="Body Text" w:semiHidden="1" w:unhideWhenUsed="1"/>
     <w:lsdException w:name="Body Text Indent" w:semiHidden="1" w:unhideWhenUsed="1"/>
     <w:lsdException w:name="List Continue" w:semiHidden="1" w:unhideWhenUsed="1"/>
@@ -2350,8 +2101,8 @@
     <w:lsdException w:name="Subtle Reference" w:uiPriority="31" w:qFormat="1"/>
     <w:lsdException w:name="Intense Reference" w:uiPriority="32" w:qFormat="1"/>
     <w:lsdException w:name="Book Title" w:uiPriority="33" w:qFormat="1"/>
-    <w:lsdException w:name="Bibliography" w:semiHidden="1" w:uiPriority="37" w:unhideWhenUsed="1"/>
-    <w:lsdException w:name="TOC Heading" w:semiHidden="1" w:uiPriority="39" w:unhideWhenUsed="1" w:qFormat="1"/>
+    <w:lsdException w:name="Bibliography" w:uiPriority="37" w:semiHidden="1" w:unhideWhenUsed="1"/>
+    <w:lsdException w:name="TOC Heading" w:uiPriority="39" w:semiHidden="1" w:unhideWhenUsed="1" w:qFormat="1"/>
     <w:lsdException w:name="Plain Table 1" w:uiPriority="41"/>
     <w:lsdException w:name="Plain Table 2" w:uiPriority="42"/>
     <w:lsdException w:name="Plain Table 3" w:uiPriority="43"/>
@@ -2461,7 +2212,7 @@
     <w:lsdException w:name="Hashtag" w:semiHidden="1" w:unhideWhenUsed="1"/>
     <w:lsdException w:name="Unresolved Mention" w:semiHidden="1" w:unhideWhenUsed="1"/>
   </w:latentStyles>
-  <w:style w:type="paragraph" w:default="1" w:styleId="Normal">
+  <w:style w:type="paragraph" w:styleId="Normal" w:default="1">
     <w:name w:val="Normal"/>
     <w:qFormat/>
     <w:rsid w:val="00D8053F"/>
@@ -2483,7 +2234,7 @@
       <w:keepNext/>
       <w:keepLines/>
       <w:pBdr>
-        <w:bottom w:val="single" w:sz="12" w:space="1" w:color="0B5294" w:themeColor="accent1" w:themeShade="BF"/>
+        <w:bottom w:val="single" w:color="0B5294" w:themeColor="accent1" w:themeShade="BF" w:sz="12" w:space="1"/>
       </w:pBdr>
       <w:spacing w:before="240" w:after="0"/>
       <w:outlineLvl w:val="1"/>
@@ -2496,13 +2247,13 @@
       <w:szCs w:val="26"/>
     </w:rPr>
   </w:style>
-  <w:style w:type="character" w:default="1" w:styleId="DefaultParagraphFont">
+  <w:style w:type="character" w:styleId="DefaultParagraphFont" w:default="1">
     <w:name w:val="Default Paragraph Font"/>
     <w:uiPriority w:val="1"/>
     <w:semiHidden/>
     <w:unhideWhenUsed/>
   </w:style>
-  <w:style w:type="table" w:default="1" w:styleId="TableNormal">
+  <w:style w:type="table" w:styleId="TableNormal" w:default="1">
     <w:name w:val="Normal Table"/>
     <w:uiPriority w:val="99"/>
     <w:semiHidden/>
@@ -2517,7 +2268,7 @@
       </w:tblCellMar>
     </w:tblPr>
   </w:style>
-  <w:style w:type="numbering" w:default="1" w:styleId="NoList">
+  <w:style w:type="numbering" w:styleId="NoList" w:default="1">
     <w:name w:val="No List"/>
     <w:uiPriority w:val="99"/>
     <w:semiHidden/>
@@ -2533,23 +2284,23 @@
     </w:pPr>
     <w:tblPr>
       <w:tblBorders>
-        <w:top w:val="single" w:sz="4" w:space="0" w:color="auto"/>
-        <w:left w:val="single" w:sz="4" w:space="0" w:color="auto"/>
-        <w:bottom w:val="single" w:sz="4" w:space="0" w:color="auto"/>
-        <w:right w:val="single" w:sz="4" w:space="0" w:color="auto"/>
-        <w:insideH w:val="single" w:sz="4" w:space="0" w:color="auto"/>
-        <w:insideV w:val="single" w:sz="4" w:space="0" w:color="auto"/>
+        <w:top w:val="single" w:color="auto" w:sz="4" w:space="0"/>
+        <w:left w:val="single" w:color="auto" w:sz="4" w:space="0"/>
+        <w:bottom w:val="single" w:color="auto" w:sz="4" w:space="0"/>
+        <w:right w:val="single" w:color="auto" w:sz="4" w:space="0"/>
+        <w:insideH w:val="single" w:color="auto" w:sz="4" w:space="0"/>
+        <w:insideV w:val="single" w:color="auto" w:sz="4" w:space="0"/>
       </w:tblBorders>
     </w:tblPr>
   </w:style>
-  <w:style w:type="character" w:customStyle="1" w:styleId="Heading2Char">
+  <w:style w:type="character" w:styleId="Heading2Char" w:customStyle="1">
     <w:name w:val="Heading 2 Char"/>
     <w:basedOn w:val="DefaultParagraphFont"/>
     <w:link w:val="Heading2"/>
     <w:uiPriority w:val="9"/>
     <w:rsid w:val="001535EB"/>
     <w:rPr>
-      <w:rFonts w:ascii="Arial" w:eastAsiaTheme="majorEastAsia" w:hAnsi="Arial" w:cstheme="majorBidi"/>
+      <w:rFonts w:ascii="Arial" w:hAnsi="Arial" w:eastAsiaTheme="majorEastAsia" w:cstheme="majorBidi"/>
       <w:b/>
       <w:color w:val="0B5294" w:themeColor="accent1" w:themeShade="BF"/>
       <w:sz w:val="24"/>
@@ -2568,12 +2319,12 @@
       <w:contextualSpacing/>
     </w:pPr>
     <w:rPr>
-      <w:rFonts w:asciiTheme="minorHAnsi" w:eastAsiaTheme="minorEastAsia" w:hAnsiTheme="minorHAnsi"/>
+      <w:rFonts w:asciiTheme="minorHAnsi" w:hAnsiTheme="minorHAnsi" w:eastAsiaTheme="minorEastAsia"/>
       <w:szCs w:val="20"/>
       <w:lang w:val="en"/>
     </w:rPr>
   </w:style>
-  <w:style w:type="paragraph" w:customStyle="1" w:styleId="NumberedList">
+  <w:style w:type="paragraph" w:styleId="NumberedList" w:customStyle="1">
     <w:name w:val="Numbered List"/>
     <w:qFormat/>
     <w:rsid w:val="00427E5E"/>
@@ -2588,7 +2339,7 @@
       <w:lang w:val="en"/>
     </w:rPr>
   </w:style>
-  <w:style w:type="paragraph" w:customStyle="1" w:styleId="FrameContents">
+  <w:style w:type="paragraph" w:styleId="FrameContents" w:customStyle="1">
     <w:name w:val="Frame Contents"/>
     <w:basedOn w:val="Normal"/>
     <w:qFormat/>
@@ -2597,7 +2348,7 @@
       <w:spacing w:after="80" w:line="240" w:lineRule="auto"/>
     </w:pPr>
     <w:rPr>
-      <w:rFonts w:asciiTheme="minorHAnsi" w:eastAsiaTheme="minorEastAsia" w:hAnsiTheme="minorHAnsi"/>
+      <w:rFonts w:asciiTheme="minorHAnsi" w:hAnsiTheme="minorHAnsi" w:eastAsiaTheme="minorEastAsia"/>
       <w:szCs w:val="20"/>
       <w:lang w:val="en"/>
     </w:rPr>
@@ -2617,7 +2368,7 @@
       <w:spacing w:after="0" w:line="240" w:lineRule="auto"/>
     </w:pPr>
   </w:style>
-  <w:style w:type="character" w:customStyle="1" w:styleId="HeaderChar">
+  <w:style w:type="character" w:styleId="HeaderChar" w:customStyle="1">
     <w:name w:val="Header Char"/>
     <w:basedOn w:val="DefaultParagraphFont"/>
     <w:link w:val="Header"/>
@@ -2643,7 +2394,7 @@
       <w:spacing w:after="0" w:line="240" w:lineRule="auto"/>
     </w:pPr>
   </w:style>
-  <w:style w:type="character" w:customStyle="1" w:styleId="FooterChar">
+  <w:style w:type="character" w:styleId="FooterChar" w:customStyle="1">
     <w:name w:val="Footer Char"/>
     <w:basedOn w:val="DefaultParagraphFont"/>
     <w:link w:val="Footer"/>
@@ -2659,7 +2410,7 @@
 </file>
 
 <file path=word/theme/theme1.xml><?xml version="1.0" encoding="utf-8"?>
-<a:theme xmlns:a="http://schemas.openxmlformats.org/drawingml/2006/main" name="Office Theme">
+<a:theme xmlns:a="http://schemas.openxmlformats.org/drawingml/2006/main" xmlns:thm15="http://schemas.microsoft.com/office/thememl/2012/main" name="Office Theme">
   <a:themeElements>
     <a:clrScheme name="Blue">
       <a:dk1>

</xml_diff>